<commit_message>
update phụ lục 2
</commit_message>
<xml_diff>
--- a/Phụ lục 2/PHỤ LỤC 2.docx
+++ b/Phụ lục 2/PHỤ LỤC 2.docx
@@ -173,7 +173,14 @@
           <w:color w:val="000000" w:themeColor="text1"/>
           <w:lang w:val="vi-VN"/>
         </w:rPr>
-        <w:t xml:space="preserve">Mã xác thực (API Token): 8876533610:AAFiHx_Lwd0yWy4cFbN43TNVLksqP7T5HhA </w:t>
+        <w:t xml:space="preserve">Mã xác thực (API Token): </w:t>
+      </w:r>
+      <w:r>
+        <w:rPr>
+          <w:color w:val="000000" w:themeColor="text1"/>
+          <w:lang w:val="vi-VN"/>
+        </w:rPr>
+        <w:t>“.................................”</w:t>
       </w:r>
     </w:p>
     <w:p>
@@ -473,7 +480,6 @@
                 <w:color w:val="000000" w:themeColor="text1"/>
                 <w:lang w:val="vi-VN"/>
               </w:rPr>
-              <w:lastRenderedPageBreak/>
               <w:t>from telegram import Update</w:t>
             </w:r>
           </w:p>
@@ -494,6 +500,7 @@
                 <w:color w:val="000000" w:themeColor="text1"/>
                 <w:lang w:val="vi-VN"/>
               </w:rPr>
+              <w:lastRenderedPageBreak/>
               <w:t>from telegram.ext import Ap``plicationBuilder, ContextTypes, CommandHandler, MessageHandler, filters</w:t>
             </w:r>
           </w:p>
@@ -830,7 +837,15 @@
                 <w:color w:val="000000" w:themeColor="text1"/>
                 <w:lang w:val="vi-VN"/>
               </w:rPr>
-              <w:t xml:space="preserve">    TOKEN = "8876533610:AAFiHx_Lwd0yWy4cFbN43TNVLksqP7T5HhA"</w:t>
+              <w:t xml:space="preserve">    TOKEN = "</w:t>
+            </w:r>
+            <w:r>
+              <w:rPr>
+                <w:rFonts w:ascii="Courier New" w:hAnsi="Courier New" w:cs="Courier New"/>
+                <w:color w:val="000000" w:themeColor="text1"/>
+                <w:lang w:val="vi-VN"/>
+              </w:rPr>
+              <w:t>Chèn token vào đây”</w:t>
             </w:r>
           </w:p>
           <w:p>
@@ -870,7 +885,6 @@
                 <w:color w:val="000000" w:themeColor="text1"/>
                 <w:lang w:val="vi-VN"/>
               </w:rPr>
-              <w:lastRenderedPageBreak/>
               <w:t xml:space="preserve">    app = ApplicationBuilder().token(TOKEN).build()</w:t>
             </w:r>
           </w:p>
@@ -911,6 +925,7 @@
                 <w:color w:val="000000" w:themeColor="text1"/>
                 <w:lang w:val="vi-VN"/>
               </w:rPr>
+              <w:lastRenderedPageBreak/>
               <w:t xml:space="preserve">    # Đăng ký các bộ xử lý (Handlers)</w:t>
             </w:r>
           </w:p>
@@ -1295,7 +1310,6 @@
           <w:color w:val="000000" w:themeColor="text1"/>
           <w:lang w:val="vi-VN"/>
         </w:rPr>
-        <w:lastRenderedPageBreak/>
         <w:t>Liên kết kho lưu trữ:</w:t>
       </w:r>
       <w:r>
@@ -1354,6 +1368,7 @@
           <w:color w:val="000000" w:themeColor="text1"/>
           <w:lang w:val="vi-VN"/>
         </w:rPr>
+        <w:lastRenderedPageBreak/>
         <w:t>Cấu hình lệnh cài đặt (Build Command):</w:t>
       </w:r>
       <w:r>
@@ -2984,6 +2999,7 @@
       <w:numPr>
         <w:ilvl w:val="1"/>
       </w:numPr>
+      <w:ind w:left="10" w:hanging="10"/>
     </w:pPr>
     <w:rPr>
       <w:rFonts w:eastAsiaTheme="majorEastAsia" w:cstheme="majorBidi"/>

</xml_diff>